<commit_message>
feat: update landing page UI and modify existing components
</commit_message>
<xml_diff>
--- a/Proposal/HNU - Graduation - Matgarco Proposal - With Business (6).docx
+++ b/Proposal/HNU - Graduation - Matgarco Proposal - With Business (6).docx
@@ -1758,6 +1758,30 @@
                 <w:sz w:val="32"/>
                 <w:szCs w:val="32"/>
               </w:rPr>
+              <w:t xml:space="preserve"> A</w:t>
+            </w:r>
+            <w:r>
+              <w:rPr>
+                <w:rFonts w:asciiTheme="majorBidi" w:hAnsiTheme="majorBidi" w:cstheme="majorBidi"/>
+                <w:b/>
+                <w:bCs/>
+                <w:i/>
+                <w:iCs/>
+                <w:sz w:val="32"/>
+                <w:szCs w:val="32"/>
+              </w:rPr>
+              <w:t>bdelmged</w:t>
+            </w:r>
+            <w:r>
+              <w:rPr>
+                <w:rFonts w:asciiTheme="majorBidi" w:hAnsiTheme="majorBidi" w:cstheme="majorBidi"/>
+                <w:b/>
+                <w:bCs/>
+                <w:i/>
+                <w:iCs/>
+                <w:sz w:val="32"/>
+                <w:szCs w:val="32"/>
+              </w:rPr>
               <w:t>.</w:t>
             </w:r>
           </w:p>
@@ -9476,14 +9500,7 @@
           <w:b/>
           <w:bCs/>
         </w:rPr>
-        <w:t>895,200</w:t>
-      </w:r>
-      <w:r>
-        <w:rPr>
-          <w:b/>
-          <w:bCs/>
-        </w:rPr>
-        <w:t xml:space="preserve"> </w:t>
+        <w:t xml:space="preserve">895,200 </w:t>
       </w:r>
       <w:r>
         <w:rPr>
@@ -9535,21 +9552,13 @@
           <w:b/>
           <w:bCs/>
         </w:rPr>
-        <w:t>996,000</w:t>
-      </w:r>
-      <w:r>
-        <w:rPr>
-          <w:b/>
-          <w:bCs/>
-        </w:rPr>
-        <w:t xml:space="preserve"> EGP.</w:t>
+        <w:t>996,000 EGP.</w:t>
       </w:r>
     </w:p>
     <w:p>
       <w:pPr>
         <w:ind w:left="720"/>
         <w:rPr>
-          <w:rFonts w:hint="cs"/>
           <w:rtl/>
           <w:lang w:bidi="ar-EG"/>
         </w:rPr>
@@ -12859,7 +12868,7 @@
           <w:lang w:val="ar-SA"/>
         </w:rPr>
         <w:drawing>
-          <wp:anchor distT="0" distB="0" distL="114300" distR="114300" simplePos="0" relativeHeight="251691008" behindDoc="0" locked="0" layoutInCell="1" allowOverlap="1" wp14:anchorId="00D939BF" wp14:editId="778108CD">
+          <wp:anchor distT="0" distB="0" distL="114300" distR="114300" simplePos="0" relativeHeight="251691008" behindDoc="0" locked="0" layoutInCell="1" allowOverlap="1" wp14:anchorId="00D939BF" wp14:editId="650BEE92">
             <wp:simplePos x="0" y="0"/>
             <wp:positionH relativeFrom="margin">
               <wp:align>center</wp:align>
@@ -13019,7 +13028,7 @@
           <w:lang w:bidi="ar-EG"/>
         </w:rPr>
         <w:drawing>
-          <wp:anchor distT="0" distB="0" distL="114300" distR="114300" simplePos="0" relativeHeight="251693056" behindDoc="0" locked="0" layoutInCell="1" allowOverlap="1" wp14:anchorId="26D59427" wp14:editId="2260D2BB">
+          <wp:anchor distT="0" distB="0" distL="114300" distR="114300" simplePos="0" relativeHeight="251693056" behindDoc="0" locked="0" layoutInCell="1" allowOverlap="1" wp14:anchorId="26D59427" wp14:editId="024325C0">
             <wp:simplePos x="0" y="0"/>
             <wp:positionH relativeFrom="margin">
               <wp:align>center</wp:align>
@@ -27977,6 +27986,7 @@
   <w:style w:type="character" w:default="1" w:styleId="DefaultParagraphFont">
     <w:name w:val="Default Paragraph Font"/>
     <w:uiPriority w:val="1"/>
+    <w:semiHidden/>
     <w:unhideWhenUsed/>
   </w:style>
   <w:style w:type="table" w:default="1" w:styleId="TableNormal">

</xml_diff>